<commit_message>
feat(medic8): add patient-account separation billing model — context, scope, and user stories
</commit_message>
<xml_diff>
--- a/projects/Medic8/02-requirements-engineering/UserStories.docx
+++ b/projects/Medic8/02-requirements-engineering/UserStories.docx
@@ -28,7 +28,7 @@
         </w:p>
       </w:sdtContent>
     </w:sdt>
-    <w:bookmarkStart w:id="165" w:name="X143dce9433cd9b0474055991d2851a8245680d3"/>
+    <w:bookmarkStart w:id="168" w:name="X143dce9433cd9b0474055991d2851a8245680d3"/>
     <w:p>
       <w:pPr>
         <w:pStyle w:val="Heading1"/>
@@ -6476,7 +6476,7 @@
     </w:p>
     <w:bookmarkEnd w:id="77"/>
     <w:bookmarkEnd w:id="78"/>
-    <w:bookmarkStart w:id="87" w:name="epic-billing-us-bil"/>
+    <w:bookmarkStart w:id="90" w:name="epic-billing-us-bil"/>
     <w:p>
       <w:pPr>
         <w:pStyle w:val="Heading2"/>
@@ -7390,23 +7390,13 @@
       </w:r>
     </w:p>
     <w:bookmarkEnd w:id="86"/>
-    <w:bookmarkEnd w:id="87"/>
-    <w:bookmarkStart w:id="93" w:name="epic-appointments-us-apt"/>
-    <w:p>
-      <w:pPr>
-        <w:pStyle w:val="Heading2"/>
-      </w:pPr>
-      <w:r>
-        <w:t xml:space="preserve">Epic: Appointments (US-APT)</w:t>
-      </w:r>
-    </w:p>
-    <w:bookmarkStart w:id="88" w:name="us-apt-001-book-appointment"/>
+    <w:bookmarkStart w:id="87" w:name="Xb4108a718a70fc6111a8de50e21abdac2ac4bc9"/>
     <w:p>
       <w:pPr>
         <w:pStyle w:val="Heading3"/>
       </w:pPr>
       <w:r>
-        <w:t xml:space="preserve">US-APT-001: Book Appointment</w:t>
+        <w:t xml:space="preserve">US-BIL-009: Auto-Create Billing Account on Patient Registration</w:t>
       </w:r>
     </w:p>
     <w:p>
@@ -7414,19 +7404,19 @@
         <w:pStyle w:val="FirstParagraph"/>
       </w:pPr>
       <w:r>
-        <w:t xml:space="preserve">As a Receptionist</w:t>
-      </w:r>
-      <w:r>
-        <w:t xml:space="preserve"> </w:t>
-      </w:r>
-      <w:r>
-        <w:t xml:space="preserve">I want to book an appointment for a patient with a specific doctor on a specific date and time</w:t>
-      </w:r>
-      <w:r>
-        <w:t xml:space="preserve"> </w:t>
-      </w:r>
-      <w:r>
-        <w:t xml:space="preserve">So that the patient has a confirmed slot and the doctor's schedule is managed</w:t>
+        <w:t xml:space="preserve">As a Front-Desk Clerk</w:t>
+      </w:r>
+      <w:r>
+        <w:t xml:space="preserve"> </w:t>
+      </w:r>
+      <w:r>
+        <w:t xml:space="preserve">I want a billing account to be created automatically when I register a new patient</w:t>
+      </w:r>
+      <w:r>
+        <w:t xml:space="preserve"> </w:t>
+      </w:r>
+      <w:r>
+        <w:t xml:space="preserve">So that I do not have to perform a separate account setup step for routine registrations</w:t>
       </w:r>
     </w:p>
     <w:p>
@@ -7446,7 +7436,16 @@
         </w:numPr>
       </w:pPr>
       <w:r>
-        <w:t xml:space="preserve">Given the Receptionist opens the appointment booking screen, When they select a doctor, date, and time slot, Then the appointment is created and linked to the patient record</w:t>
+        <w:t xml:space="preserve">Given a new patient is registered, when the registration is saved, then the system creates a billing account linked to that patient with account type</w:t>
+      </w:r>
+      <w:r>
+        <w:t xml:space="preserve"> </w:t>
+      </w:r>
+      <w:r>
+        <w:rPr>
+          <w:rStyle w:val="VerbatimChar"/>
+        </w:rPr>
+        <w:t xml:space="preserve">individual</w:t>
       </w:r>
     </w:p>
     <w:p>
@@ -7458,7 +7457,7 @@
         </w:numPr>
       </w:pPr>
       <w:r>
-        <w:t xml:space="preserve">Given the selected slot is already occupied, When the Receptionist attempts to book, Then the system displays a conflict warning and suggests the next 3 available slots</w:t>
+        <w:t xml:space="preserve">Given the account is created automatically, when I view the patient record, then I see the linked account name without navigating away from the patient view</w:t>
       </w:r>
     </w:p>
     <w:p>
@@ -7470,7 +7469,19 @@
         </w:numPr>
       </w:pPr>
       <w:r>
-        <w:t xml:space="preserve">Given the appointment is booked, When it is confirmed, Then a confirmation message is available for the patient (SMS if phone is on file)</w:t>
+        <w:t xml:space="preserve">Given the account type is</w:t>
+      </w:r>
+      <w:r>
+        <w:t xml:space="preserve"> </w:t>
+      </w:r>
+      <w:r>
+        <w:rPr>
+          <w:rStyle w:val="VerbatimChar"/>
+        </w:rPr>
+        <w:t xml:space="preserve">individual</w:t>
+      </w:r>
+      <w:r>
+        <w:t xml:space="preserve">, when no billing administrator has changed it, then all charges for this patient post to the auto-created account</w:t>
       </w:r>
     </w:p>
     <w:p>
@@ -7478,7 +7489,7 @@
         <w:pStyle w:val="FirstParagraph"/>
       </w:pPr>
       <w:r>
-        <w:t xml:space="preserve">Story Points: 5</w:t>
+        <w:t xml:space="preserve">Story Points: 2</w:t>
       </w:r>
       <w:r>
         <w:t xml:space="preserve"> </w:t>
@@ -7490,7 +7501,7 @@
         <w:t xml:space="preserve"> </w:t>
       </w:r>
       <w:r>
-        <w:t xml:space="preserve">Epic: Appointments</w:t>
+        <w:t xml:space="preserve">Epic: Billing</w:t>
       </w:r>
       <w:r>
         <w:t xml:space="preserve"> </w:t>
@@ -7506,14 +7517,14 @@
         </w:pict>
       </w:r>
     </w:p>
-    <w:bookmarkEnd w:id="88"/>
-    <w:bookmarkStart w:id="89" w:name="X2ce604dcfddf6a874657e6915c9a0d095b524df"/>
+    <w:bookmarkEnd w:id="87"/>
+    <w:bookmarkStart w:id="88" w:name="Xc92ff887ac89aa137dde993d4c107ca5baf85de"/>
     <w:p>
       <w:pPr>
         <w:pStyle w:val="Heading3"/>
       </w:pPr>
       <w:r>
-        <w:t xml:space="preserve">US-APT-002: Send SMS Reminder 24 Hours Before</w:t>
+        <w:t xml:space="preserve">US-BIL-010: Link Multiple Patients to One Billing Account</w:t>
       </w:r>
     </w:p>
     <w:p>
@@ -7521,19 +7532,19 @@
         <w:pStyle w:val="FirstParagraph"/>
       </w:pPr>
       <w:r>
-        <w:t xml:space="preserve">As a Patient</w:t>
-      </w:r>
-      <w:r>
-        <w:t xml:space="preserve"> </w:t>
-      </w:r>
-      <w:r>
-        <w:t xml:space="preserve">I want to receive an SMS reminder 24 hours before my appointment</w:t>
-      </w:r>
-      <w:r>
-        <w:t xml:space="preserve"> </w:t>
-      </w:r>
-      <w:r>
-        <w:t xml:space="preserve">So that I am reminded to attend and can reschedule if needed</w:t>
+        <w:t xml:space="preserve">As a Billing Administrator</w:t>
+      </w:r>
+      <w:r>
+        <w:t xml:space="preserve"> </w:t>
+      </w:r>
+      <w:r>
+        <w:t xml:space="preserve">I want to link additional patients to an existing billing account</w:t>
+      </w:r>
+      <w:r>
+        <w:t xml:space="preserve"> </w:t>
+      </w:r>
+      <w:r>
+        <w:t xml:space="preserve">So that a family, school, or employer can receive a consolidated invoice for all covered patients</w:t>
       </w:r>
     </w:p>
     <w:p>
@@ -7553,7 +7564,20 @@
         </w:numPr>
       </w:pPr>
       <w:r>
-        <w:t xml:space="preserve">Given an appointment is booked and the patient has a phone number on file, When 24 hours remain before the appointment, Then an SMS is sent containing: facility name, doctor name, date, time, and a contact number for rescheduling</w:t>
+        <w:t xml:space="preserve">Given I am viewing an existing billing account, when I select</w:t>
+      </w:r>
+      <w:r>
+        <w:t xml:space="preserve"> </w:t>
+      </w:r>
+      <w:r>
+        <w:rPr>
+          <w:b/>
+          <w:bCs/>
+        </w:rPr>
+        <w:t xml:space="preserve">Add Patient</w:t>
+      </w:r>
+      <w:r>
+        <w:t xml:space="preserve">, then I can search by patient name or ID and link them to this account</w:t>
       </w:r>
     </w:p>
     <w:p>
@@ -7565,7 +7589,7 @@
         </w:numPr>
       </w:pPr>
       <w:r>
-        <w:t xml:space="preserve">Given the SMS is sent, When delivery status is available, Then the system records whether the SMS was delivered or failed</w:t>
+        <w:t xml:space="preserve">Given a patient is linked to a shared account, when a charge is posted for that patient, then the charge appears on the shared account's invoice, not on the patient's former individual account</w:t>
       </w:r>
     </w:p>
     <w:p>
@@ -7577,7 +7601,64 @@
         </w:numPr>
       </w:pPr>
       <w:r>
-        <w:t xml:space="preserve">Given the patient does not have a phone number, When the 24-hour mark is reached, Then no SMS is sent and no error is raised</w:t>
+        <w:t xml:space="preserve">Given an account is of type</w:t>
+      </w:r>
+      <w:r>
+        <w:t xml:space="preserve"> </w:t>
+      </w:r>
+      <w:r>
+        <w:rPr>
+          <w:rStyle w:val="VerbatimChar"/>
+        </w:rPr>
+        <w:t xml:space="preserve">individual</w:t>
+      </w:r>
+      <w:r>
+        <w:t xml:space="preserve">, when a second patient is linked to it, then the system automatically upgrades the account type to the appropriate group type (</w:t>
+      </w:r>
+      <w:r>
+        <w:rPr>
+          <w:rStyle w:val="VerbatimChar"/>
+        </w:rPr>
+        <w:t xml:space="preserve">family</w:t>
+      </w:r>
+      <w:r>
+        <w:t xml:space="preserve">,</w:t>
+      </w:r>
+      <w:r>
+        <w:t xml:space="preserve"> </w:t>
+      </w:r>
+      <w:r>
+        <w:rPr>
+          <w:rStyle w:val="VerbatimChar"/>
+        </w:rPr>
+        <w:t xml:space="preserve">institutional</w:t>
+      </w:r>
+      <w:r>
+        <w:t xml:space="preserve">,</w:t>
+      </w:r>
+      <w:r>
+        <w:t xml:space="preserve"> </w:t>
+      </w:r>
+      <w:r>
+        <w:rPr>
+          <w:rStyle w:val="VerbatimChar"/>
+        </w:rPr>
+        <w:t xml:space="preserve">corporate</w:t>
+      </w:r>
+      <w:r>
+        <w:t xml:space="preserve">, or</w:t>
+      </w:r>
+      <w:r>
+        <w:t xml:space="preserve"> </w:t>
+      </w:r>
+      <w:r>
+        <w:rPr>
+          <w:rStyle w:val="VerbatimChar"/>
+        </w:rPr>
+        <w:t xml:space="preserve">insurance_group</w:t>
+      </w:r>
+      <w:r>
+        <w:t xml:space="preserve">) and prompts the administrator to confirm the type</w:t>
       </w:r>
     </w:p>
     <w:p>
@@ -7591,19 +7672,19 @@
         <w:t xml:space="preserve"> </w:t>
       </w:r>
       <w:r>
-        <w:t xml:space="preserve">Priority: Medium</w:t>
-      </w:r>
-      <w:r>
-        <w:t xml:space="preserve"> </w:t>
-      </w:r>
-      <w:r>
-        <w:t xml:space="preserve">Epic: Appointments</w:t>
-      </w:r>
-      <w:r>
-        <w:t xml:space="preserve"> </w:t>
-      </w:r>
-      <w:r>
-        <w:t xml:space="preserve">Phase: 1</w:t>
+        <w:t xml:space="preserve">Priority: High</w:t>
+      </w:r>
+      <w:r>
+        <w:t xml:space="preserve"> </w:t>
+      </w:r>
+      <w:r>
+        <w:t xml:space="preserve">Epic: Billing</w:t>
+      </w:r>
+      <w:r>
+        <w:t xml:space="preserve"> </w:t>
+      </w:r>
+      <w:r>
+        <w:t xml:space="preserve">Phase: 2</w:t>
       </w:r>
     </w:p>
     <w:p>
@@ -7613,14 +7694,14 @@
         </w:pict>
       </w:r>
     </w:p>
-    <w:bookmarkEnd w:id="89"/>
-    <w:bookmarkStart w:id="90" w:name="X0487a98d53366e6833f45eb05bedd2ba96c5fe5"/>
+    <w:bookmarkEnd w:id="88"/>
+    <w:bookmarkStart w:id="89" w:name="X6ed44afeb56e240abca6dc668959c0259d565f0"/>
     <w:p>
       <w:pPr>
         <w:pStyle w:val="Heading3"/>
       </w:pPr>
       <w:r>
-        <w:t xml:space="preserve">US-APT-003: Set Doctor Availability Calendar</w:t>
+        <w:t xml:space="preserve">US-BIL-011: Patient Portal Shows Own Charges Only</w:t>
       </w:r>
     </w:p>
     <w:p>
@@ -7628,19 +7709,19 @@
         <w:pStyle w:val="FirstParagraph"/>
       </w:pPr>
       <w:r>
-        <w:t xml:space="preserve">As a Facility Admin</w:t>
-      </w:r>
-      <w:r>
-        <w:t xml:space="preserve"> </w:t>
-      </w:r>
-      <w:r>
-        <w:t xml:space="preserve">I want to configure each doctor's availability calendar (days, hours, slot duration)</w:t>
-      </w:r>
-      <w:r>
-        <w:t xml:space="preserve"> </w:t>
-      </w:r>
-      <w:r>
-        <w:t xml:space="preserve">So that appointments can only be booked within the doctor's available times</w:t>
+        <w:t xml:space="preserve">As a Patient (via patient portal)</w:t>
+      </w:r>
+      <w:r>
+        <w:t xml:space="preserve"> </w:t>
+      </w:r>
+      <w:r>
+        <w:t xml:space="preserve">I want to see only my own charges in the patient portal</w:t>
+      </w:r>
+      <w:r>
+        <w:t xml:space="preserve"> </w:t>
+      </w:r>
+      <w:r>
+        <w:t xml:space="preserve">So that my billing information remains private even if I share a billing account with family members</w:t>
       </w:r>
     </w:p>
     <w:p>
@@ -7660,7 +7741,7 @@
         </w:numPr>
       </w:pPr>
       <w:r>
-        <w:t xml:space="preserve">Given the Facility Admin opens the availability settings for a doctor, When they set available days, start/end times, and slot duration, Then the configuration is saved</w:t>
+        <w:t xml:space="preserve">Given I am logged into the patient portal, when I view the Billing section, then I see only charges attributed to my patient ID, not to other patients on the same account</w:t>
       </w:r>
     </w:p>
     <w:p>
@@ -7672,7 +7753,7 @@
         </w:numPr>
       </w:pPr>
       <w:r>
-        <w:t xml:space="preserve">Given availability is configured, When the Receptionist attempts to book outside available hours, Then the system blocks the booking and shows available alternatives</w:t>
+        <w:t xml:space="preserve">Given my family's billing account has charges for multiple patients, when I view my statement, then only my line items are shown and the total reflects my charges only</w:t>
       </w:r>
     </w:p>
     <w:p>
@@ -7684,7 +7765,7 @@
         </w:numPr>
       </w:pPr>
       <w:r>
-        <w:t xml:space="preserve">Given the doctor's schedule changes, When the Facility Admin updates availability, Then future bookings are not affected but new bookings follow the updated schedule</w:t>
+        <w:t xml:space="preserve">Given a family member's charges exist on the shared account, when I access the portal, then I have no way to view, access, or download their charges</w:t>
       </w:r>
     </w:p>
     <w:p>
@@ -7692,7 +7773,7 @@
         <w:pStyle w:val="FirstParagraph"/>
       </w:pPr>
       <w:r>
-        <w:t xml:space="preserve">Story Points: 3</w:t>
+        <w:t xml:space="preserve">Story Points: 2</w:t>
       </w:r>
       <w:r>
         <w:t xml:space="preserve"> </w:t>
@@ -7704,13 +7785,13 @@
         <w:t xml:space="preserve"> </w:t>
       </w:r>
       <w:r>
-        <w:t xml:space="preserve">Epic: Appointments</w:t>
-      </w:r>
-      <w:r>
-        <w:t xml:space="preserve"> </w:t>
-      </w:r>
-      <w:r>
-        <w:t xml:space="preserve">Phase: 1</w:t>
+        <w:t xml:space="preserve">Epic: Billing</w:t>
+      </w:r>
+      <w:r>
+        <w:t xml:space="preserve"> </w:t>
+      </w:r>
+      <w:r>
+        <w:t xml:space="preserve">Phase: 2</w:t>
       </w:r>
     </w:p>
     <w:p>
@@ -7720,13 +7801,344 @@
         </w:pict>
       </w:r>
     </w:p>
+    <w:bookmarkEnd w:id="89"/>
     <w:bookmarkEnd w:id="90"/>
-    <w:bookmarkStart w:id="91" w:name="us-apt-004-convert-arrival-to-opd-queue"/>
+    <w:bookmarkStart w:id="96" w:name="epic-appointments-us-apt"/>
+    <w:p>
+      <w:pPr>
+        <w:pStyle w:val="Heading2"/>
+      </w:pPr>
+      <w:r>
+        <w:t xml:space="preserve">Epic: Appointments (US-APT)</w:t>
+      </w:r>
+    </w:p>
+    <w:bookmarkStart w:id="91" w:name="us-apt-001-book-appointment"/>
     <w:p>
       <w:pPr>
         <w:pStyle w:val="Heading3"/>
       </w:pPr>
       <w:r>
+        <w:t xml:space="preserve">US-APT-001: Book Appointment</w:t>
+      </w:r>
+    </w:p>
+    <w:p>
+      <w:pPr>
+        <w:pStyle w:val="FirstParagraph"/>
+      </w:pPr>
+      <w:r>
+        <w:t xml:space="preserve">As a Receptionist</w:t>
+      </w:r>
+      <w:r>
+        <w:t xml:space="preserve"> </w:t>
+      </w:r>
+      <w:r>
+        <w:t xml:space="preserve">I want to book an appointment for a patient with a specific doctor on a specific date and time</w:t>
+      </w:r>
+      <w:r>
+        <w:t xml:space="preserve"> </w:t>
+      </w:r>
+      <w:r>
+        <w:t xml:space="preserve">So that the patient has a confirmed slot and the doctor's schedule is managed</w:t>
+      </w:r>
+    </w:p>
+    <w:p>
+      <w:pPr>
+        <w:pStyle w:val="BodyText"/>
+      </w:pPr>
+      <w:r>
+        <w:t xml:space="preserve">Acceptance Criteria:</w:t>
+      </w:r>
+    </w:p>
+    <w:p>
+      <w:pPr>
+        <w:pStyle w:val="Compact"/>
+        <w:numPr>
+          <w:ilvl w:val="0"/>
+          <w:numId w:val="1227"/>
+        </w:numPr>
+      </w:pPr>
+      <w:r>
+        <w:t xml:space="preserve">Given the Receptionist opens the appointment booking screen, When they select a doctor, date, and time slot, Then the appointment is created and linked to the patient record</w:t>
+      </w:r>
+    </w:p>
+    <w:p>
+      <w:pPr>
+        <w:pStyle w:val="Compact"/>
+        <w:numPr>
+          <w:ilvl w:val="0"/>
+          <w:numId w:val="1228"/>
+        </w:numPr>
+      </w:pPr>
+      <w:r>
+        <w:t xml:space="preserve">Given the selected slot is already occupied, When the Receptionist attempts to book, Then the system displays a conflict warning and suggests the next 3 available slots</w:t>
+      </w:r>
+    </w:p>
+    <w:p>
+      <w:pPr>
+        <w:pStyle w:val="Compact"/>
+        <w:numPr>
+          <w:ilvl w:val="0"/>
+          <w:numId w:val="1229"/>
+        </w:numPr>
+      </w:pPr>
+      <w:r>
+        <w:t xml:space="preserve">Given the appointment is booked, When it is confirmed, Then a confirmation message is available for the patient (SMS if phone is on file)</w:t>
+      </w:r>
+    </w:p>
+    <w:p>
+      <w:pPr>
+        <w:pStyle w:val="FirstParagraph"/>
+      </w:pPr>
+      <w:r>
+        <w:t xml:space="preserve">Story Points: 5</w:t>
+      </w:r>
+      <w:r>
+        <w:t xml:space="preserve"> </w:t>
+      </w:r>
+      <w:r>
+        <w:t xml:space="preserve">Priority: High</w:t>
+      </w:r>
+      <w:r>
+        <w:t xml:space="preserve"> </w:t>
+      </w:r>
+      <w:r>
+        <w:t xml:space="preserve">Epic: Appointments</w:t>
+      </w:r>
+      <w:r>
+        <w:t xml:space="preserve"> </w:t>
+      </w:r>
+      <w:r>
+        <w:t xml:space="preserve">Phase: 1</w:t>
+      </w:r>
+    </w:p>
+    <w:p>
+      <w:r>
+        <w:pict>
+          <v:rect style="width:0;height:1.5pt" o:hralign="center" o:hrstd="t" o:hr="t"/>
+        </w:pict>
+      </w:r>
+    </w:p>
+    <w:bookmarkEnd w:id="91"/>
+    <w:bookmarkStart w:id="92" w:name="X2ce604dcfddf6a874657e6915c9a0d095b524df"/>
+    <w:p>
+      <w:pPr>
+        <w:pStyle w:val="Heading3"/>
+      </w:pPr>
+      <w:r>
+        <w:t xml:space="preserve">US-APT-002: Send SMS Reminder 24 Hours Before</w:t>
+      </w:r>
+    </w:p>
+    <w:p>
+      <w:pPr>
+        <w:pStyle w:val="FirstParagraph"/>
+      </w:pPr>
+      <w:r>
+        <w:t xml:space="preserve">As a Patient</w:t>
+      </w:r>
+      <w:r>
+        <w:t xml:space="preserve"> </w:t>
+      </w:r>
+      <w:r>
+        <w:t xml:space="preserve">I want to receive an SMS reminder 24 hours before my appointment</w:t>
+      </w:r>
+      <w:r>
+        <w:t xml:space="preserve"> </w:t>
+      </w:r>
+      <w:r>
+        <w:t xml:space="preserve">So that I am reminded to attend and can reschedule if needed</w:t>
+      </w:r>
+    </w:p>
+    <w:p>
+      <w:pPr>
+        <w:pStyle w:val="BodyText"/>
+      </w:pPr>
+      <w:r>
+        <w:t xml:space="preserve">Acceptance Criteria:</w:t>
+      </w:r>
+    </w:p>
+    <w:p>
+      <w:pPr>
+        <w:pStyle w:val="Compact"/>
+        <w:numPr>
+          <w:ilvl w:val="0"/>
+          <w:numId w:val="1230"/>
+        </w:numPr>
+      </w:pPr>
+      <w:r>
+        <w:t xml:space="preserve">Given an appointment is booked and the patient has a phone number on file, When 24 hours remain before the appointment, Then an SMS is sent containing: facility name, doctor name, date, time, and a contact number for rescheduling</w:t>
+      </w:r>
+    </w:p>
+    <w:p>
+      <w:pPr>
+        <w:pStyle w:val="Compact"/>
+        <w:numPr>
+          <w:ilvl w:val="0"/>
+          <w:numId w:val="1231"/>
+        </w:numPr>
+      </w:pPr>
+      <w:r>
+        <w:t xml:space="preserve">Given the SMS is sent, When delivery status is available, Then the system records whether the SMS was delivered or failed</w:t>
+      </w:r>
+    </w:p>
+    <w:p>
+      <w:pPr>
+        <w:pStyle w:val="Compact"/>
+        <w:numPr>
+          <w:ilvl w:val="0"/>
+          <w:numId w:val="1232"/>
+        </w:numPr>
+      </w:pPr>
+      <w:r>
+        <w:t xml:space="preserve">Given the patient does not have a phone number, When the 24-hour mark is reached, Then no SMS is sent and no error is raised</w:t>
+      </w:r>
+    </w:p>
+    <w:p>
+      <w:pPr>
+        <w:pStyle w:val="FirstParagraph"/>
+      </w:pPr>
+      <w:r>
+        <w:t xml:space="preserve">Story Points: 3</w:t>
+      </w:r>
+      <w:r>
+        <w:t xml:space="preserve"> </w:t>
+      </w:r>
+      <w:r>
+        <w:t xml:space="preserve">Priority: Medium</w:t>
+      </w:r>
+      <w:r>
+        <w:t xml:space="preserve"> </w:t>
+      </w:r>
+      <w:r>
+        <w:t xml:space="preserve">Epic: Appointments</w:t>
+      </w:r>
+      <w:r>
+        <w:t xml:space="preserve"> </w:t>
+      </w:r>
+      <w:r>
+        <w:t xml:space="preserve">Phase: 1</w:t>
+      </w:r>
+    </w:p>
+    <w:p>
+      <w:r>
+        <w:pict>
+          <v:rect style="width:0;height:1.5pt" o:hralign="center" o:hrstd="t" o:hr="t"/>
+        </w:pict>
+      </w:r>
+    </w:p>
+    <w:bookmarkEnd w:id="92"/>
+    <w:bookmarkStart w:id="93" w:name="X0487a98d53366e6833f45eb05bedd2ba96c5fe5"/>
+    <w:p>
+      <w:pPr>
+        <w:pStyle w:val="Heading3"/>
+      </w:pPr>
+      <w:r>
+        <w:t xml:space="preserve">US-APT-003: Set Doctor Availability Calendar</w:t>
+      </w:r>
+    </w:p>
+    <w:p>
+      <w:pPr>
+        <w:pStyle w:val="FirstParagraph"/>
+      </w:pPr>
+      <w:r>
+        <w:t xml:space="preserve">As a Facility Admin</w:t>
+      </w:r>
+      <w:r>
+        <w:t xml:space="preserve"> </w:t>
+      </w:r>
+      <w:r>
+        <w:t xml:space="preserve">I want to configure each doctor's availability calendar (days, hours, slot duration)</w:t>
+      </w:r>
+      <w:r>
+        <w:t xml:space="preserve"> </w:t>
+      </w:r>
+      <w:r>
+        <w:t xml:space="preserve">So that appointments can only be booked within the doctor's available times</w:t>
+      </w:r>
+    </w:p>
+    <w:p>
+      <w:pPr>
+        <w:pStyle w:val="BodyText"/>
+      </w:pPr>
+      <w:r>
+        <w:t xml:space="preserve">Acceptance Criteria:</w:t>
+      </w:r>
+    </w:p>
+    <w:p>
+      <w:pPr>
+        <w:pStyle w:val="Compact"/>
+        <w:numPr>
+          <w:ilvl w:val="0"/>
+          <w:numId w:val="1233"/>
+        </w:numPr>
+      </w:pPr>
+      <w:r>
+        <w:t xml:space="preserve">Given the Facility Admin opens the availability settings for a doctor, When they set available days, start/end times, and slot duration, Then the configuration is saved</w:t>
+      </w:r>
+    </w:p>
+    <w:p>
+      <w:pPr>
+        <w:pStyle w:val="Compact"/>
+        <w:numPr>
+          <w:ilvl w:val="0"/>
+          <w:numId w:val="1234"/>
+        </w:numPr>
+      </w:pPr>
+      <w:r>
+        <w:t xml:space="preserve">Given availability is configured, When the Receptionist attempts to book outside available hours, Then the system blocks the booking and shows available alternatives</w:t>
+      </w:r>
+    </w:p>
+    <w:p>
+      <w:pPr>
+        <w:pStyle w:val="Compact"/>
+        <w:numPr>
+          <w:ilvl w:val="0"/>
+          <w:numId w:val="1235"/>
+        </w:numPr>
+      </w:pPr>
+      <w:r>
+        <w:t xml:space="preserve">Given the doctor's schedule changes, When the Facility Admin updates availability, Then future bookings are not affected but new bookings follow the updated schedule</w:t>
+      </w:r>
+    </w:p>
+    <w:p>
+      <w:pPr>
+        <w:pStyle w:val="FirstParagraph"/>
+      </w:pPr>
+      <w:r>
+        <w:t xml:space="preserve">Story Points: 3</w:t>
+      </w:r>
+      <w:r>
+        <w:t xml:space="preserve"> </w:t>
+      </w:r>
+      <w:r>
+        <w:t xml:space="preserve">Priority: High</w:t>
+      </w:r>
+      <w:r>
+        <w:t xml:space="preserve"> </w:t>
+      </w:r>
+      <w:r>
+        <w:t xml:space="preserve">Epic: Appointments</w:t>
+      </w:r>
+      <w:r>
+        <w:t xml:space="preserve"> </w:t>
+      </w:r>
+      <w:r>
+        <w:t xml:space="preserve">Phase: 1</w:t>
+      </w:r>
+    </w:p>
+    <w:p>
+      <w:r>
+        <w:pict>
+          <v:rect style="width:0;height:1.5pt" o:hralign="center" o:hrstd="t" o:hr="t"/>
+        </w:pict>
+      </w:r>
+    </w:p>
+    <w:bookmarkEnd w:id="93"/>
+    <w:bookmarkStart w:id="94" w:name="us-apt-004-convert-arrival-to-opd-queue"/>
+    <w:p>
+      <w:pPr>
+        <w:pStyle w:val="Heading3"/>
+      </w:pPr>
+      <w:r>
         <w:t xml:space="preserve">US-APT-004: Convert Arrival to OPD Queue</w:t>
       </w:r>
     </w:p>
@@ -7763,7 +8175,7 @@
         <w:pStyle w:val="Compact"/>
         <w:numPr>
           <w:ilvl w:val="0"/>
-          <w:numId w:val="1227"/>
+          <w:numId w:val="1236"/>
         </w:numPr>
       </w:pPr>
       <w:r>
@@ -7788,7 +8200,7 @@
         <w:pStyle w:val="Compact"/>
         <w:numPr>
           <w:ilvl w:val="0"/>
-          <w:numId w:val="1228"/>
+          <w:numId w:val="1237"/>
         </w:numPr>
       </w:pPr>
       <w:r>
@@ -7800,7 +8212,7 @@
         <w:pStyle w:val="Compact"/>
         <w:numPr>
           <w:ilvl w:val="0"/>
-          <w:numId w:val="1229"/>
+          <w:numId w:val="1238"/>
         </w:numPr>
       </w:pPr>
       <w:r>
@@ -7840,8 +8252,8 @@
         </w:pict>
       </w:r>
     </w:p>
-    <w:bookmarkEnd w:id="91"/>
-    <w:bookmarkStart w:id="92" w:name="us-apt-005-add-walk-in-to-queue"/>
+    <w:bookmarkEnd w:id="94"/>
+    <w:bookmarkStart w:id="95" w:name="us-apt-005-add-walk-in-to-queue"/>
     <w:p>
       <w:pPr>
         <w:pStyle w:val="Heading3"/>
@@ -7883,7 +8295,7 @@
         <w:pStyle w:val="Compact"/>
         <w:numPr>
           <w:ilvl w:val="0"/>
-          <w:numId w:val="1230"/>
+          <w:numId w:val="1239"/>
         </w:numPr>
       </w:pPr>
       <w:r>
@@ -7895,7 +8307,7 @@
         <w:pStyle w:val="Compact"/>
         <w:numPr>
           <w:ilvl w:val="0"/>
-          <w:numId w:val="1231"/>
+          <w:numId w:val="1240"/>
         </w:numPr>
       </w:pPr>
       <w:r>
@@ -7907,7 +8319,7 @@
         <w:pStyle w:val="Compact"/>
         <w:numPr>
           <w:ilvl w:val="0"/>
-          <w:numId w:val="1232"/>
+          <w:numId w:val="1241"/>
         </w:numPr>
       </w:pPr>
       <w:r>
@@ -7947,9 +8359,9 @@
         </w:pict>
       </w:r>
     </w:p>
-    <w:bookmarkEnd w:id="92"/>
-    <w:bookmarkEnd w:id="93"/>
-    <w:bookmarkStart w:id="99" w:name="epic-access-control-us-rbac"/>
+    <w:bookmarkEnd w:id="95"/>
+    <w:bookmarkEnd w:id="96"/>
+    <w:bookmarkStart w:id="102" w:name="epic-access-control-us-rbac"/>
     <w:p>
       <w:pPr>
         <w:pStyle w:val="Heading2"/>
@@ -7958,7 +8370,7 @@
         <w:t xml:space="preserve">Epic: Access Control (US-RBAC)</w:t>
       </w:r>
     </w:p>
-    <w:bookmarkStart w:id="94" w:name="us-rbac-001-assign-role-to-staff-member"/>
+    <w:bookmarkStart w:id="97" w:name="us-rbac-001-assign-role-to-staff-member"/>
     <w:p>
       <w:pPr>
         <w:pStyle w:val="Heading3"/>
@@ -8000,7 +8412,7 @@
         <w:pStyle w:val="Compact"/>
         <w:numPr>
           <w:ilvl w:val="0"/>
-          <w:numId w:val="1233"/>
+          <w:numId w:val="1242"/>
         </w:numPr>
       </w:pPr>
       <w:r>
@@ -8012,7 +8424,7 @@
         <w:pStyle w:val="Compact"/>
         <w:numPr>
           <w:ilvl w:val="0"/>
-          <w:numId w:val="1234"/>
+          <w:numId w:val="1243"/>
         </w:numPr>
       </w:pPr>
       <w:r>
@@ -8024,7 +8436,7 @@
         <w:pStyle w:val="Compact"/>
         <w:numPr>
           <w:ilvl w:val="0"/>
-          <w:numId w:val="1235"/>
+          <w:numId w:val="1244"/>
         </w:numPr>
       </w:pPr>
       <w:r>
@@ -8064,8 +8476,8 @@
         </w:pict>
       </w:r>
     </w:p>
-    <w:bookmarkEnd w:id="94"/>
-    <w:bookmarkStart w:id="95" w:name="Xc5439d293a66023a5a3a341b673a2eae702db0e"/>
+    <w:bookmarkEnd w:id="97"/>
+    <w:bookmarkStart w:id="98" w:name="Xc5439d293a66023a5a3a341b673a2eae702db0e"/>
     <w:p>
       <w:pPr>
         <w:pStyle w:val="Heading3"/>
@@ -8107,7 +8519,7 @@
         <w:pStyle w:val="Compact"/>
         <w:numPr>
           <w:ilvl w:val="0"/>
-          <w:numId w:val="1236"/>
+          <w:numId w:val="1245"/>
         </w:numPr>
       </w:pPr>
       <w:r>
@@ -8119,7 +8531,7 @@
         <w:pStyle w:val="Compact"/>
         <w:numPr>
           <w:ilvl w:val="0"/>
-          <w:numId w:val="1237"/>
+          <w:numId w:val="1246"/>
         </w:numPr>
       </w:pPr>
       <w:r>
@@ -8131,7 +8543,7 @@
         <w:pStyle w:val="Compact"/>
         <w:numPr>
           <w:ilvl w:val="0"/>
-          <w:numId w:val="1238"/>
+          <w:numId w:val="1247"/>
         </w:numPr>
       </w:pPr>
       <w:r>
@@ -8171,8 +8583,8 @@
         </w:pict>
       </w:r>
     </w:p>
-    <w:bookmarkEnd w:id="95"/>
-    <w:bookmarkStart w:id="96" w:name="Xd9abe8a36fdaf2639bf9ace5788d5855479181f"/>
+    <w:bookmarkEnd w:id="98"/>
+    <w:bookmarkStart w:id="99" w:name="Xd9abe8a36fdaf2639bf9ace5788d5855479181f"/>
     <w:p>
       <w:pPr>
         <w:pStyle w:val="Heading3"/>
@@ -8214,7 +8626,7 @@
         <w:pStyle w:val="Compact"/>
         <w:numPr>
           <w:ilvl w:val="0"/>
-          <w:numId w:val="1239"/>
+          <w:numId w:val="1248"/>
         </w:numPr>
       </w:pPr>
       <w:r>
@@ -8226,7 +8638,7 @@
         <w:pStyle w:val="Compact"/>
         <w:numPr>
           <w:ilvl w:val="0"/>
-          <w:numId w:val="1240"/>
+          <w:numId w:val="1249"/>
         </w:numPr>
       </w:pPr>
       <w:r>
@@ -8238,7 +8650,7 @@
         <w:pStyle w:val="Compact"/>
         <w:numPr>
           <w:ilvl w:val="0"/>
-          <w:numId w:val="1241"/>
+          <w:numId w:val="1250"/>
         </w:numPr>
       </w:pPr>
       <w:r>
@@ -8278,8 +8690,8 @@
         </w:pict>
       </w:r>
     </w:p>
-    <w:bookmarkEnd w:id="96"/>
-    <w:bookmarkStart w:id="97" w:name="X0fd05207189e395bacb8e5b2665eeeb12a52103"/>
+    <w:bookmarkEnd w:id="99"/>
+    <w:bookmarkStart w:id="100" w:name="X0fd05207189e395bacb8e5b2665eeeb12a52103"/>
     <w:p>
       <w:pPr>
         <w:pStyle w:val="Heading3"/>
@@ -8321,7 +8733,7 @@
         <w:pStyle w:val="Compact"/>
         <w:numPr>
           <w:ilvl w:val="0"/>
-          <w:numId w:val="1242"/>
+          <w:numId w:val="1251"/>
         </w:numPr>
       </w:pPr>
       <w:r>
@@ -8333,7 +8745,7 @@
         <w:pStyle w:val="Compact"/>
         <w:numPr>
           <w:ilvl w:val="0"/>
-          <w:numId w:val="1243"/>
+          <w:numId w:val="1252"/>
         </w:numPr>
       </w:pPr>
       <w:r>
@@ -8345,7 +8757,7 @@
         <w:pStyle w:val="Compact"/>
         <w:numPr>
           <w:ilvl w:val="0"/>
-          <w:numId w:val="1244"/>
+          <w:numId w:val="1253"/>
         </w:numPr>
       </w:pPr>
       <w:r>
@@ -8357,7 +8769,7 @@
         <w:pStyle w:val="Compact"/>
         <w:numPr>
           <w:ilvl w:val="0"/>
-          <w:numId w:val="1245"/>
+          <w:numId w:val="1254"/>
         </w:numPr>
       </w:pPr>
       <w:r>
@@ -8369,7 +8781,7 @@
         <w:pStyle w:val="Compact"/>
         <w:numPr>
           <w:ilvl w:val="0"/>
-          <w:numId w:val="1246"/>
+          <w:numId w:val="1255"/>
         </w:numPr>
       </w:pPr>
       <w:r>
@@ -8409,8 +8821,8 @@
         </w:pict>
       </w:r>
     </w:p>
-    <w:bookmarkEnd w:id="97"/>
-    <w:bookmarkStart w:id="98" w:name="us-rbac-005-view-immutable-audit-trail"/>
+    <w:bookmarkEnd w:id="100"/>
+    <w:bookmarkStart w:id="101" w:name="us-rbac-005-view-immutable-audit-trail"/>
     <w:p>
       <w:pPr>
         <w:pStyle w:val="Heading3"/>
@@ -8452,7 +8864,7 @@
         <w:pStyle w:val="Compact"/>
         <w:numPr>
           <w:ilvl w:val="0"/>
-          <w:numId w:val="1247"/>
+          <w:numId w:val="1256"/>
         </w:numPr>
       </w:pPr>
       <w:r>
@@ -8464,7 +8876,7 @@
         <w:pStyle w:val="Compact"/>
         <w:numPr>
           <w:ilvl w:val="0"/>
-          <w:numId w:val="1248"/>
+          <w:numId w:val="1257"/>
         </w:numPr>
       </w:pPr>
       <w:r>
@@ -8476,7 +8888,7 @@
         <w:pStyle w:val="Compact"/>
         <w:numPr>
           <w:ilvl w:val="0"/>
-          <w:numId w:val="1249"/>
+          <w:numId w:val="1258"/>
         </w:numPr>
       </w:pPr>
       <w:r>
@@ -8516,9 +8928,9 @@
         </w:pict>
       </w:r>
     </w:p>
-    <w:bookmarkEnd w:id="98"/>
-    <w:bookmarkEnd w:id="99"/>
-    <w:bookmarkStart w:id="100" w:name="phase-2-epics-summary-level"/>
+    <w:bookmarkEnd w:id="101"/>
+    <w:bookmarkEnd w:id="102"/>
+    <w:bookmarkStart w:id="103" w:name="phase-2-epics-summary-level"/>
     <w:p>
       <w:pPr>
         <w:pStyle w:val="Heading2"/>
@@ -8534,8 +8946,8 @@
         </w:pict>
       </w:r>
     </w:p>
-    <w:bookmarkEnd w:id="100"/>
-    <w:bookmarkStart w:id="104" w:name="epic-inpatient-department-us-ipd"/>
+    <w:bookmarkEnd w:id="103"/>
+    <w:bookmarkStart w:id="107" w:name="epic-inpatient-department-us-ipd"/>
     <w:p>
       <w:pPr>
         <w:pStyle w:val="Heading2"/>
@@ -8544,7 +8956,7 @@
         <w:t xml:space="preserve">Epic: Inpatient Department (US-IPD)</w:t>
       </w:r>
     </w:p>
-    <w:bookmarkStart w:id="101" w:name="X1df723e131eb1c729f45b4e825fe26fb1e287be"/>
+    <w:bookmarkStart w:id="104" w:name="X1df723e131eb1c729f45b4e825fe26fb1e287be"/>
     <w:p>
       <w:pPr>
         <w:pStyle w:val="Heading3"/>
@@ -8606,8 +9018,8 @@
         </w:pict>
       </w:r>
     </w:p>
-    <w:bookmarkEnd w:id="101"/>
-    <w:bookmarkStart w:id="102" w:name="Xb86eb3be04074fada0266d96663a0350830075b"/>
+    <w:bookmarkEnd w:id="104"/>
+    <w:bookmarkStart w:id="105" w:name="Xb86eb3be04074fada0266d96663a0350830075b"/>
     <w:p>
       <w:pPr>
         <w:pStyle w:val="Heading3"/>
@@ -8669,8 +9081,8 @@
         </w:pict>
       </w:r>
     </w:p>
-    <w:bookmarkEnd w:id="102"/>
-    <w:bookmarkStart w:id="103" w:name="Xd4ca5031e58f4ee62f5e53d8a37ccc53a04d79e"/>
+    <w:bookmarkEnd w:id="105"/>
+    <w:bookmarkStart w:id="106" w:name="Xd4ca5031e58f4ee62f5e53d8a37ccc53a04d79e"/>
     <w:p>
       <w:pPr>
         <w:pStyle w:val="Heading3"/>
@@ -8732,9 +9144,9 @@
         </w:pict>
       </w:r>
     </w:p>
-    <w:bookmarkEnd w:id="103"/>
-    <w:bookmarkEnd w:id="104"/>
-    <w:bookmarkStart w:id="108" w:name="epic-maternity-us-mat"/>
+    <w:bookmarkEnd w:id="106"/>
+    <w:bookmarkEnd w:id="107"/>
+    <w:bookmarkStart w:id="111" w:name="epic-maternity-us-mat"/>
     <w:p>
       <w:pPr>
         <w:pStyle w:val="Heading2"/>
@@ -8743,7 +9155,7 @@
         <w:t xml:space="preserve">Epic: Maternity (US-MAT)</w:t>
       </w:r>
     </w:p>
-    <w:bookmarkStart w:id="105" w:name="X5b35d9a4a6980f71b5a917c0966f1bae9fc1a59"/>
+    <w:bookmarkStart w:id="108" w:name="X5b35d9a4a6980f71b5a917c0966f1bae9fc1a59"/>
     <w:p>
       <w:pPr>
         <w:pStyle w:val="Heading3"/>
@@ -8805,8 +9217,8 @@
         </w:pict>
       </w:r>
     </w:p>
-    <w:bookmarkEnd w:id="105"/>
-    <w:bookmarkStart w:id="106" w:name="X1689d1a9df74766a988f8af355e3dd9c72f0439"/>
+    <w:bookmarkEnd w:id="108"/>
+    <w:bookmarkStart w:id="109" w:name="X1689d1a9df74766a988f8af355e3dd9c72f0439"/>
     <w:p>
       <w:pPr>
         <w:pStyle w:val="Heading3"/>
@@ -8868,8 +9280,8 @@
         </w:pict>
       </w:r>
     </w:p>
-    <w:bookmarkEnd w:id="106"/>
-    <w:bookmarkStart w:id="107" w:name="us-mat-003-record-postnatal-visits"/>
+    <w:bookmarkEnd w:id="109"/>
+    <w:bookmarkStart w:id="110" w:name="us-mat-003-record-postnatal-visits"/>
     <w:p>
       <w:pPr>
         <w:pStyle w:val="Heading3"/>
@@ -8931,9 +9343,9 @@
         </w:pict>
       </w:r>
     </w:p>
-    <w:bookmarkEnd w:id="107"/>
-    <w:bookmarkEnd w:id="108"/>
-    <w:bookmarkStart w:id="112" w:name="epic-immunisation-us-imm"/>
+    <w:bookmarkEnd w:id="110"/>
+    <w:bookmarkEnd w:id="111"/>
+    <w:bookmarkStart w:id="115" w:name="epic-immunisation-us-imm"/>
     <w:p>
       <w:pPr>
         <w:pStyle w:val="Heading2"/>
@@ -8942,7 +9354,7 @@
         <w:t xml:space="preserve">Epic: Immunisation (US-IMM)</w:t>
       </w:r>
     </w:p>
-    <w:bookmarkStart w:id="109" w:name="Xd2ca2be8da12c6ae85930170050a8b0e88a54d5"/>
+    <w:bookmarkStart w:id="112" w:name="Xd2ca2be8da12c6ae85930170050a8b0e88a54d5"/>
     <w:p>
       <w:pPr>
         <w:pStyle w:val="Heading3"/>
@@ -9004,8 +9416,8 @@
         </w:pict>
       </w:r>
     </w:p>
-    <w:bookmarkEnd w:id="109"/>
-    <w:bookmarkStart w:id="110" w:name="X4a0f340e6f5cd1c5d241db68da4cacc4ad87e80"/>
+    <w:bookmarkEnd w:id="112"/>
+    <w:bookmarkStart w:id="113" w:name="X4a0f340e6f5cd1c5d241db68da4cacc4ad87e80"/>
     <w:p>
       <w:pPr>
         <w:pStyle w:val="Heading3"/>
@@ -9067,8 +9479,8 @@
         </w:pict>
       </w:r>
     </w:p>
-    <w:bookmarkEnd w:id="110"/>
-    <w:bookmarkStart w:id="111" w:name="X5626cd15efab13524c0a232501eb0a790e6542c"/>
+    <w:bookmarkEnd w:id="113"/>
+    <w:bookmarkStart w:id="114" w:name="X5626cd15efab13524c0a232501eb0a790e6542c"/>
     <w:p>
       <w:pPr>
         <w:pStyle w:val="Heading3"/>
@@ -9130,9 +9542,9 @@
         </w:pict>
       </w:r>
     </w:p>
-    <w:bookmarkEnd w:id="111"/>
-    <w:bookmarkEnd w:id="112"/>
-    <w:bookmarkStart w:id="116" w:name="epic-emergency-department-us-emr"/>
+    <w:bookmarkEnd w:id="114"/>
+    <w:bookmarkEnd w:id="115"/>
+    <w:bookmarkStart w:id="119" w:name="epic-emergency-department-us-emr"/>
     <w:p>
       <w:pPr>
         <w:pStyle w:val="Heading2"/>
@@ -9141,7 +9553,7 @@
         <w:t xml:space="preserve">Epic: Emergency Department (US-EMR)</w:t>
       </w:r>
     </w:p>
-    <w:bookmarkStart w:id="113" w:name="us-emr-001-rapid-triage-with-avpugcs"/>
+    <w:bookmarkStart w:id="116" w:name="us-emr-001-rapid-triage-with-avpugcs"/>
     <w:p>
       <w:pPr>
         <w:pStyle w:val="Heading3"/>
@@ -9203,8 +9615,8 @@
         </w:pict>
       </w:r>
     </w:p>
-    <w:bookmarkEnd w:id="113"/>
-    <w:bookmarkStart w:id="114" w:name="X370afdee507a81a4cf5b3e1582eb333ff8abbcc"/>
+    <w:bookmarkEnd w:id="116"/>
+    <w:bookmarkStart w:id="117" w:name="X370afdee507a81a4cf5b3e1582eb333ff8abbcc"/>
     <w:p>
       <w:pPr>
         <w:pStyle w:val="Heading3"/>
@@ -9266,8 +9678,8 @@
         </w:pict>
       </w:r>
     </w:p>
-    <w:bookmarkEnd w:id="114"/>
-    <w:bookmarkStart w:id="115" w:name="X21449e9680a97b1e7f1b6fa73523920cb4f7eff"/>
+    <w:bookmarkEnd w:id="117"/>
+    <w:bookmarkStart w:id="118" w:name="X21449e9680a97b1e7f1b6fa73523920cb4f7eff"/>
     <w:p>
       <w:pPr>
         <w:pStyle w:val="Heading3"/>
@@ -9329,9 +9741,9 @@
         </w:pict>
       </w:r>
     </w:p>
-    <w:bookmarkEnd w:id="115"/>
-    <w:bookmarkEnd w:id="116"/>
-    <w:bookmarkStart w:id="120" w:name="epic-insurance-management-us-ins"/>
+    <w:bookmarkEnd w:id="118"/>
+    <w:bookmarkEnd w:id="119"/>
+    <w:bookmarkStart w:id="123" w:name="epic-insurance-management-us-ins"/>
     <w:p>
       <w:pPr>
         <w:pStyle w:val="Heading2"/>
@@ -9340,7 +9752,7 @@
         <w:t xml:space="preserve">Epic: Insurance Management (US-INS)</w:t>
       </w:r>
     </w:p>
-    <w:bookmarkStart w:id="117" w:name="X2d85b8fea8e90cb26664ea0ca3c983c356ac6dc"/>
+    <w:bookmarkStart w:id="120" w:name="X2d85b8fea8e90cb26664ea0ca3c983c356ac6dc"/>
     <w:p>
       <w:pPr>
         <w:pStyle w:val="Heading3"/>
@@ -9402,8 +9814,8 @@
         </w:pict>
       </w:r>
     </w:p>
-    <w:bookmarkEnd w:id="117"/>
-    <w:bookmarkStart w:id="118" w:name="Xdc048ea12e55c468125040d5b34712b6eea219c"/>
+    <w:bookmarkEnd w:id="120"/>
+    <w:bookmarkStart w:id="121" w:name="Xdc048ea12e55c468125040d5b34712b6eea219c"/>
     <w:p>
       <w:pPr>
         <w:pStyle w:val="Heading3"/>
@@ -9465,8 +9877,8 @@
         </w:pict>
       </w:r>
     </w:p>
-    <w:bookmarkEnd w:id="118"/>
-    <w:bookmarkStart w:id="119" w:name="X3eca661ec41ecfd929ab302732fb07d97560c93"/>
+    <w:bookmarkEnd w:id="121"/>
+    <w:bookmarkStart w:id="122" w:name="X3eca661ec41ecfd929ab302732fb07d97560c93"/>
     <w:p>
       <w:pPr>
         <w:pStyle w:val="Heading3"/>
@@ -9528,9 +9940,9 @@
         </w:pict>
       </w:r>
     </w:p>
-    <w:bookmarkEnd w:id="119"/>
-    <w:bookmarkEnd w:id="120"/>
-    <w:bookmarkStart w:id="124" w:name="epic-hr-and-payroll-us-hr"/>
+    <w:bookmarkEnd w:id="122"/>
+    <w:bookmarkEnd w:id="123"/>
+    <w:bookmarkStart w:id="127" w:name="epic-hr-and-payroll-us-hr"/>
     <w:p>
       <w:pPr>
         <w:pStyle w:val="Heading2"/>
@@ -9539,7 +9951,7 @@
         <w:t xml:space="preserve">Epic: HR and Payroll (US-HR)</w:t>
       </w:r>
     </w:p>
-    <w:bookmarkStart w:id="121" w:name="X20e2969060aafa8a3103ed45c3844a01f5ed017"/>
+    <w:bookmarkStart w:id="124" w:name="X20e2969060aafa8a3103ed45c3844a01f5ed017"/>
     <w:p>
       <w:pPr>
         <w:pStyle w:val="Heading3"/>
@@ -9601,8 +10013,8 @@
         </w:pict>
       </w:r>
     </w:p>
-    <w:bookmarkEnd w:id="121"/>
-    <w:bookmarkStart w:id="122" w:name="Xe8a2b79f8442a62858f94cb7e7054916b751b24"/>
+    <w:bookmarkEnd w:id="124"/>
+    <w:bookmarkStart w:id="125" w:name="Xe8a2b79f8442a62858f94cb7e7054916b751b24"/>
     <w:p>
       <w:pPr>
         <w:pStyle w:val="Heading3"/>
@@ -9664,8 +10076,8 @@
         </w:pict>
       </w:r>
     </w:p>
-    <w:bookmarkEnd w:id="122"/>
-    <w:bookmarkStart w:id="123" w:name="us-hr-003-manage-duty-roster"/>
+    <w:bookmarkEnd w:id="125"/>
+    <w:bookmarkStart w:id="126" w:name="us-hr-003-manage-duty-roster"/>
     <w:p>
       <w:pPr>
         <w:pStyle w:val="Heading3"/>
@@ -9727,9 +10139,9 @@
         </w:pict>
       </w:r>
     </w:p>
-    <w:bookmarkEnd w:id="123"/>
-    <w:bookmarkEnd w:id="124"/>
-    <w:bookmarkStart w:id="127" w:name="epic-hmis-reporting-us-hmis"/>
+    <w:bookmarkEnd w:id="126"/>
+    <w:bookmarkEnd w:id="127"/>
+    <w:bookmarkStart w:id="130" w:name="epic-hmis-reporting-us-hmis"/>
     <w:p>
       <w:pPr>
         <w:pStyle w:val="Heading2"/>
@@ -9738,7 +10150,7 @@
         <w:t xml:space="preserve">Epic: HMIS Reporting (US-HMIS)</w:t>
       </w:r>
     </w:p>
-    <w:bookmarkStart w:id="125" w:name="X9f26859c53554c55fb6408204cc076e502f6d2c"/>
+    <w:bookmarkStart w:id="128" w:name="X9f26859c53554c55fb6408204cc076e502f6d2c"/>
     <w:p>
       <w:pPr>
         <w:pStyle w:val="Heading3"/>
@@ -9800,8 +10212,8 @@
         </w:pict>
       </w:r>
     </w:p>
-    <w:bookmarkEnd w:id="125"/>
-    <w:bookmarkStart w:id="126" w:name="us-hmis-002-submit-reports-to-dhis2"/>
+    <w:bookmarkEnd w:id="128"/>
+    <w:bookmarkStart w:id="129" w:name="us-hmis-002-submit-reports-to-dhis2"/>
     <w:p>
       <w:pPr>
         <w:pStyle w:val="Heading3"/>
@@ -9863,9 +10275,9 @@
         </w:pict>
       </w:r>
     </w:p>
-    <w:bookmarkEnd w:id="126"/>
-    <w:bookmarkEnd w:id="127"/>
-    <w:bookmarkStart w:id="131" w:name="epic-inventory-management-us-inv"/>
+    <w:bookmarkEnd w:id="129"/>
+    <w:bookmarkEnd w:id="130"/>
+    <w:bookmarkStart w:id="134" w:name="epic-inventory-management-us-inv"/>
     <w:p>
       <w:pPr>
         <w:pStyle w:val="Heading2"/>
@@ -9874,7 +10286,7 @@
         <w:t xml:space="preserve">Epic: Inventory Management (US-INV)</w:t>
       </w:r>
     </w:p>
-    <w:bookmarkStart w:id="128" w:name="X2b6b75241faedcd8dfde261fd4987a44d003dc6"/>
+    <w:bookmarkStart w:id="131" w:name="X2b6b75241faedcd8dfde261fd4987a44d003dc6"/>
     <w:p>
       <w:pPr>
         <w:pStyle w:val="Heading3"/>
@@ -9936,8 +10348,8 @@
         </w:pict>
       </w:r>
     </w:p>
-    <w:bookmarkEnd w:id="128"/>
-    <w:bookmarkStart w:id="129" w:name="Xbca5a41a0a14720a777fa1a3bfcef4d4c4f984b"/>
+    <w:bookmarkEnd w:id="131"/>
+    <w:bookmarkStart w:id="132" w:name="Xbca5a41a0a14720a777fa1a3bfcef4d4c4f984b"/>
     <w:p>
       <w:pPr>
         <w:pStyle w:val="Heading3"/>
@@ -9999,8 +10411,8 @@
         </w:pict>
       </w:r>
     </w:p>
-    <w:bookmarkEnd w:id="129"/>
-    <w:bookmarkStart w:id="130" w:name="Xaa867e361eb3b75d5e225e36ae18b89e6848288"/>
+    <w:bookmarkEnd w:id="132"/>
+    <w:bookmarkStart w:id="133" w:name="Xaa867e361eb3b75d5e225e36ae18b89e6848288"/>
     <w:p>
       <w:pPr>
         <w:pStyle w:val="Heading3"/>
@@ -10062,9 +10474,9 @@
         </w:pict>
       </w:r>
     </w:p>
-    <w:bookmarkEnd w:id="130"/>
-    <w:bookmarkEnd w:id="131"/>
-    <w:bookmarkStart w:id="132" w:name="phase-3-epics-summary-level"/>
+    <w:bookmarkEnd w:id="133"/>
+    <w:bookmarkEnd w:id="134"/>
+    <w:bookmarkStart w:id="135" w:name="phase-3-epics-summary-level"/>
     <w:p>
       <w:pPr>
         <w:pStyle w:val="Heading2"/>
@@ -10080,8 +10492,8 @@
         </w:pict>
       </w:r>
     </w:p>
-    <w:bookmarkEnd w:id="132"/>
-    <w:bookmarkStart w:id="135" w:name="epic-hivaids-programme-us-hiv"/>
+    <w:bookmarkEnd w:id="135"/>
+    <w:bookmarkStart w:id="138" w:name="epic-hivaids-programme-us-hiv"/>
     <w:p>
       <w:pPr>
         <w:pStyle w:val="Heading2"/>
@@ -10090,7 +10502,7 @@
         <w:t xml:space="preserve">Epic: HIV/AIDS Programme (US-HIV)</w:t>
       </w:r>
     </w:p>
-    <w:bookmarkStart w:id="133" w:name="Xe96210e5dee72b235d0871b3e9598cf031f3191"/>
+    <w:bookmarkStart w:id="136" w:name="Xe96210e5dee72b235d0871b3e9598cf031f3191"/>
     <w:p>
       <w:pPr>
         <w:pStyle w:val="Heading3"/>
@@ -10152,8 +10564,8 @@
         </w:pict>
       </w:r>
     </w:p>
-    <w:bookmarkEnd w:id="133"/>
-    <w:bookmarkStart w:id="134" w:name="X88026b3775d11a063f73dcb683d3cee8289c11d"/>
+    <w:bookmarkEnd w:id="136"/>
+    <w:bookmarkStart w:id="137" w:name="X88026b3775d11a063f73dcb683d3cee8289c11d"/>
     <w:p>
       <w:pPr>
         <w:pStyle w:val="Heading3"/>
@@ -10215,9 +10627,9 @@
         </w:pict>
       </w:r>
     </w:p>
-    <w:bookmarkEnd w:id="134"/>
-    <w:bookmarkEnd w:id="135"/>
-    <w:bookmarkStart w:id="138" w:name="epic-tb-programme-us-tb"/>
+    <w:bookmarkEnd w:id="137"/>
+    <w:bookmarkEnd w:id="138"/>
+    <w:bookmarkStart w:id="141" w:name="epic-tb-programme-us-tb"/>
     <w:p>
       <w:pPr>
         <w:pStyle w:val="Heading2"/>
@@ -10226,7 +10638,7 @@
         <w:t xml:space="preserve">Epic: TB Programme (US-TB)</w:t>
       </w:r>
     </w:p>
-    <w:bookmarkStart w:id="136" w:name="Xb05fd63500837be89dbf189fdaaac7ee8befa9b"/>
+    <w:bookmarkStart w:id="139" w:name="Xb05fd63500837be89dbf189fdaaac7ee8befa9b"/>
     <w:p>
       <w:pPr>
         <w:pStyle w:val="Heading3"/>
@@ -10288,8 +10700,8 @@
         </w:pict>
       </w:r>
     </w:p>
-    <w:bookmarkEnd w:id="136"/>
-    <w:bookmarkStart w:id="137" w:name="us-tb-002-conduct-contact-tracing"/>
+    <w:bookmarkEnd w:id="139"/>
+    <w:bookmarkStart w:id="140" w:name="us-tb-002-conduct-contact-tracing"/>
     <w:p>
       <w:pPr>
         <w:pStyle w:val="Heading3"/>
@@ -10351,9 +10763,9 @@
         </w:pict>
       </w:r>
     </w:p>
-    <w:bookmarkEnd w:id="137"/>
-    <w:bookmarkEnd w:id="138"/>
-    <w:bookmarkStart w:id="141" w:name="X5193c4921bfe29309a5c5dc169f00fbc2790a7b"/>
+    <w:bookmarkEnd w:id="140"/>
+    <w:bookmarkEnd w:id="141"/>
+    <w:bookmarkStart w:id="144" w:name="X5193c4921bfe29309a5c5dc169f00fbc2790a7b"/>
     <w:p>
       <w:pPr>
         <w:pStyle w:val="Heading2"/>
@@ -10362,7 +10774,7 @@
         <w:t xml:space="preserve">Epic: Patient Portal and Mobile App (US-PAT)</w:t>
       </w:r>
     </w:p>
-    <w:bookmarkStart w:id="139" w:name="X8beefa41d3307b2354d8446d387106f6f1f7cdb"/>
+    <w:bookmarkStart w:id="142" w:name="X8beefa41d3307b2354d8446d387106f6f1f7cdb"/>
     <w:p>
       <w:pPr>
         <w:pStyle w:val="Heading3"/>
@@ -10424,8 +10836,8 @@
         </w:pict>
       </w:r>
     </w:p>
-    <w:bookmarkEnd w:id="139"/>
-    <w:bookmarkStart w:id="140" w:name="X3fb5d4aa9ffb802955319951d2a8e6bba6d207e"/>
+    <w:bookmarkEnd w:id="142"/>
+    <w:bookmarkStart w:id="143" w:name="X3fb5d4aa9ffb802955319951d2a8e6bba6d207e"/>
     <w:p>
       <w:pPr>
         <w:pStyle w:val="Heading3"/>
@@ -10487,9 +10899,9 @@
         </w:pict>
       </w:r>
     </w:p>
-    <w:bookmarkEnd w:id="140"/>
-    <w:bookmarkEnd w:id="141"/>
-    <w:bookmarkStart w:id="142" w:name="phase-4-epics-summary-level"/>
+    <w:bookmarkEnd w:id="143"/>
+    <w:bookmarkEnd w:id="144"/>
+    <w:bookmarkStart w:id="145" w:name="phase-4-epics-summary-level"/>
     <w:p>
       <w:pPr>
         <w:pStyle w:val="Heading2"/>
@@ -10505,8 +10917,8 @@
         </w:pict>
       </w:r>
     </w:p>
-    <w:bookmarkEnd w:id="142"/>
-    <w:bookmarkStart w:id="144" w:name="X8cc1632b58753ab7326c9ab16881334cbb51b60"/>
+    <w:bookmarkEnd w:id="145"/>
+    <w:bookmarkStart w:id="147" w:name="X8cc1632b58753ab7326c9ab16881334cbb51b60"/>
     <w:p>
       <w:pPr>
         <w:pStyle w:val="Heading2"/>
@@ -10515,7 +10927,7 @@
         <w:t xml:space="preserve">Epic: Theatre and Surgical Management (US-SUR)</w:t>
       </w:r>
     </w:p>
-    <w:bookmarkStart w:id="143" w:name="X833e6d035f5cb34cab55aa4107da92e5682fc6d"/>
+    <w:bookmarkStart w:id="146" w:name="X833e6d035f5cb34cab55aa4107da92e5682fc6d"/>
     <w:p>
       <w:pPr>
         <w:pStyle w:val="Heading3"/>
@@ -10577,9 +10989,9 @@
         </w:pict>
       </w:r>
     </w:p>
-    <w:bookmarkEnd w:id="143"/>
-    <w:bookmarkEnd w:id="144"/>
-    <w:bookmarkStart w:id="146" w:name="epic-blood-bank-us-blb"/>
+    <w:bookmarkEnd w:id="146"/>
+    <w:bookmarkEnd w:id="147"/>
+    <w:bookmarkStart w:id="149" w:name="epic-blood-bank-us-blb"/>
     <w:p>
       <w:pPr>
         <w:pStyle w:val="Heading2"/>
@@ -10588,7 +11000,7 @@
         <w:t xml:space="preserve">Epic: Blood Bank (US-BLB)</w:t>
       </w:r>
     </w:p>
-    <w:bookmarkStart w:id="145" w:name="Xefec47eb5162f7e2b86b8b6587fc5bcfce6e19d"/>
+    <w:bookmarkStart w:id="148" w:name="Xefec47eb5162f7e2b86b8b6587fc5bcfce6e19d"/>
     <w:p>
       <w:pPr>
         <w:pStyle w:val="Heading3"/>
@@ -10650,9 +11062,9 @@
         </w:pict>
       </w:r>
     </w:p>
-    <w:bookmarkEnd w:id="145"/>
-    <w:bookmarkEnd w:id="146"/>
-    <w:bookmarkStart w:id="148" w:name="epic-director-platform-us-dir"/>
+    <w:bookmarkEnd w:id="148"/>
+    <w:bookmarkEnd w:id="149"/>
+    <w:bookmarkStart w:id="151" w:name="epic-director-platform-us-dir"/>
     <w:p>
       <w:pPr>
         <w:pStyle w:val="Heading2"/>
@@ -10661,7 +11073,7 @@
         <w:t xml:space="preserve">Epic: Director Platform (US-DIR)</w:t>
       </w:r>
     </w:p>
-    <w:bookmarkStart w:id="147" w:name="X5d261c2455da3752471144c4662e18e9a7cd33f"/>
+    <w:bookmarkStart w:id="150" w:name="X5d261c2455da3752471144c4662e18e9a7cd33f"/>
     <w:p>
       <w:pPr>
         <w:pStyle w:val="Heading3"/>
@@ -10723,9 +11135,9 @@
         </w:pict>
       </w:r>
     </w:p>
-    <w:bookmarkEnd w:id="147"/>
-    <w:bookmarkEnd w:id="148"/>
-    <w:bookmarkStart w:id="157" w:name="epic-ai-intelligence-us-ai"/>
+    <w:bookmarkEnd w:id="150"/>
+    <w:bookmarkEnd w:id="151"/>
+    <w:bookmarkStart w:id="160" w:name="epic-ai-intelligence-us-ai"/>
     <w:p>
       <w:pPr>
         <w:pStyle w:val="Heading2"/>
@@ -10734,7 +11146,7 @@
         <w:t xml:space="preserve">Epic: AI Intelligence (US-AI)</w:t>
       </w:r>
     </w:p>
-    <w:bookmarkStart w:id="149" w:name="us-ai-001-ai-clinical-note-draft"/>
+    <w:bookmarkStart w:id="152" w:name="us-ai-001-ai-clinical-note-draft"/>
     <w:p>
       <w:pPr>
         <w:pStyle w:val="Heading3"/>
@@ -10764,7 +11176,7 @@
         <w:pStyle w:val="Compact"/>
         <w:numPr>
           <w:ilvl w:val="0"/>
-          <w:numId w:val="1250"/>
+          <w:numId w:val="1259"/>
         </w:numPr>
       </w:pPr>
       <w:r>
@@ -10789,7 +11201,7 @@
         <w:pStyle w:val="Compact"/>
         <w:numPr>
           <w:ilvl w:val="0"/>
-          <w:numId w:val="1251"/>
+          <w:numId w:val="1260"/>
         </w:numPr>
       </w:pPr>
       <w:r>
@@ -10833,7 +11245,7 @@
         <w:pStyle w:val="Compact"/>
         <w:numPr>
           <w:ilvl w:val="0"/>
-          <w:numId w:val="1252"/>
+          <w:numId w:val="1261"/>
         </w:numPr>
       </w:pPr>
       <w:r>
@@ -10858,7 +11270,7 @@
         <w:pStyle w:val="Compact"/>
         <w:numPr>
           <w:ilvl w:val="0"/>
-          <w:numId w:val="1253"/>
+          <w:numId w:val="1262"/>
         </w:numPr>
       </w:pPr>
       <w:r>
@@ -10883,7 +11295,7 @@
         <w:pStyle w:val="Compact"/>
         <w:numPr>
           <w:ilvl w:val="0"/>
-          <w:numId w:val="1254"/>
+          <w:numId w:val="1263"/>
         </w:numPr>
       </w:pPr>
       <w:r>
@@ -10923,8 +11335,8 @@
         </w:pict>
       </w:r>
     </w:p>
-    <w:bookmarkEnd w:id="149"/>
-    <w:bookmarkStart w:id="150" w:name="us-ai-002-ai-icd-code-suggestions"/>
+    <w:bookmarkEnd w:id="152"/>
+    <w:bookmarkStart w:id="153" w:name="us-ai-002-ai-icd-code-suggestions"/>
     <w:p>
       <w:pPr>
         <w:pStyle w:val="Heading3"/>
@@ -10954,7 +11366,7 @@
         <w:pStyle w:val="Compact"/>
         <w:numPr>
           <w:ilvl w:val="0"/>
-          <w:numId w:val="1255"/>
+          <w:numId w:val="1264"/>
         </w:numPr>
       </w:pPr>
       <w:r>
@@ -10966,7 +11378,7 @@
         <w:pStyle w:val="Compact"/>
         <w:numPr>
           <w:ilvl w:val="0"/>
-          <w:numId w:val="1256"/>
+          <w:numId w:val="1265"/>
         </w:numPr>
       </w:pPr>
       <w:r>
@@ -10978,7 +11390,7 @@
         <w:pStyle w:val="Compact"/>
         <w:numPr>
           <w:ilvl w:val="0"/>
-          <w:numId w:val="1257"/>
+          <w:numId w:val="1266"/>
         </w:numPr>
       </w:pPr>
       <w:r>
@@ -10990,7 +11402,7 @@
         <w:pStyle w:val="Compact"/>
         <w:numPr>
           <w:ilvl w:val="0"/>
-          <w:numId w:val="1258"/>
+          <w:numId w:val="1267"/>
         </w:numPr>
       </w:pPr>
       <w:r>
@@ -11002,7 +11414,7 @@
         <w:pStyle w:val="Compact"/>
         <w:numPr>
           <w:ilvl w:val="0"/>
-          <w:numId w:val="1259"/>
+          <w:numId w:val="1268"/>
         </w:numPr>
       </w:pPr>
       <w:r>
@@ -11042,8 +11454,8 @@
         </w:pict>
       </w:r>
     </w:p>
-    <w:bookmarkEnd w:id="150"/>
-    <w:bookmarkStart w:id="151" w:name="us-ai-003-ai-differential-diagnosis"/>
+    <w:bookmarkEnd w:id="153"/>
+    <w:bookmarkStart w:id="154" w:name="us-ai-003-ai-differential-diagnosis"/>
     <w:p>
       <w:pPr>
         <w:pStyle w:val="Heading3"/>
@@ -11073,7 +11485,7 @@
         <w:pStyle w:val="Compact"/>
         <w:numPr>
           <w:ilvl w:val="0"/>
-          <w:numId w:val="1260"/>
+          <w:numId w:val="1269"/>
         </w:numPr>
       </w:pPr>
       <w:r>
@@ -11085,7 +11497,7 @@
         <w:pStyle w:val="Compact"/>
         <w:numPr>
           <w:ilvl w:val="0"/>
-          <w:numId w:val="1261"/>
+          <w:numId w:val="1270"/>
         </w:numPr>
       </w:pPr>
       <w:r>
@@ -11097,7 +11509,7 @@
         <w:pStyle w:val="Compact"/>
         <w:numPr>
           <w:ilvl w:val="0"/>
-          <w:numId w:val="1262"/>
+          <w:numId w:val="1271"/>
         </w:numPr>
       </w:pPr>
       <w:r>
@@ -11109,7 +11521,7 @@
         <w:pStyle w:val="Compact"/>
         <w:numPr>
           <w:ilvl w:val="0"/>
-          <w:numId w:val="1263"/>
+          <w:numId w:val="1272"/>
         </w:numPr>
       </w:pPr>
       <w:r>
@@ -11121,7 +11533,7 @@
         <w:pStyle w:val="Compact"/>
         <w:numPr>
           <w:ilvl w:val="0"/>
-          <w:numId w:val="1264"/>
+          <w:numId w:val="1273"/>
         </w:numPr>
       </w:pPr>
       <w:r>
@@ -11161,8 +11573,8 @@
         </w:pict>
       </w:r>
     </w:p>
-    <w:bookmarkEnd w:id="151"/>
-    <w:bookmarkStart w:id="152" w:name="X5744ab334c23b8466627460d36571aa5296761f"/>
+    <w:bookmarkEnd w:id="154"/>
+    <w:bookmarkStart w:id="155" w:name="X5744ab334c23b8466627460d36571aa5296761f"/>
     <w:p>
       <w:pPr>
         <w:pStyle w:val="Heading3"/>
@@ -11192,7 +11604,7 @@
         <w:pStyle w:val="Compact"/>
         <w:numPr>
           <w:ilvl w:val="0"/>
-          <w:numId w:val="1265"/>
+          <w:numId w:val="1274"/>
         </w:numPr>
       </w:pPr>
       <w:r>
@@ -11204,7 +11616,7 @@
         <w:pStyle w:val="Compact"/>
         <w:numPr>
           <w:ilvl w:val="0"/>
-          <w:numId w:val="1266"/>
+          <w:numId w:val="1275"/>
         </w:numPr>
       </w:pPr>
       <w:r>
@@ -11216,7 +11628,7 @@
         <w:pStyle w:val="Compact"/>
         <w:numPr>
           <w:ilvl w:val="0"/>
-          <w:numId w:val="1267"/>
+          <w:numId w:val="1276"/>
         </w:numPr>
       </w:pPr>
       <w:r>
@@ -11228,7 +11640,7 @@
         <w:pStyle w:val="Compact"/>
         <w:numPr>
           <w:ilvl w:val="0"/>
-          <w:numId w:val="1268"/>
+          <w:numId w:val="1277"/>
         </w:numPr>
       </w:pPr>
       <w:r>
@@ -11268,8 +11680,8 @@
         </w:pict>
       </w:r>
     </w:p>
-    <w:bookmarkEnd w:id="152"/>
-    <w:bookmarkStart w:id="153" w:name="us-ai-005-ai-claim-scrubbing"/>
+    <w:bookmarkEnd w:id="155"/>
+    <w:bookmarkStart w:id="156" w:name="us-ai-005-ai-claim-scrubbing"/>
     <w:p>
       <w:pPr>
         <w:pStyle w:val="Heading3"/>
@@ -11299,7 +11711,7 @@
         <w:pStyle w:val="Compact"/>
         <w:numPr>
           <w:ilvl w:val="0"/>
-          <w:numId w:val="1269"/>
+          <w:numId w:val="1278"/>
         </w:numPr>
       </w:pPr>
       <w:r>
@@ -11324,7 +11736,7 @@
         <w:pStyle w:val="Compact"/>
         <w:numPr>
           <w:ilvl w:val="0"/>
-          <w:numId w:val="1270"/>
+          <w:numId w:val="1279"/>
         </w:numPr>
       </w:pPr>
       <w:r>
@@ -11336,7 +11748,7 @@
         <w:pStyle w:val="Compact"/>
         <w:numPr>
           <w:ilvl w:val="0"/>
-          <w:numId w:val="1271"/>
+          <w:numId w:val="1280"/>
         </w:numPr>
       </w:pPr>
       <w:r>
@@ -11348,7 +11760,7 @@
         <w:pStyle w:val="Compact"/>
         <w:numPr>
           <w:ilvl w:val="0"/>
-          <w:numId w:val="1272"/>
+          <w:numId w:val="1281"/>
         </w:numPr>
       </w:pPr>
       <w:r>
@@ -11360,7 +11772,7 @@
         <w:pStyle w:val="Compact"/>
         <w:numPr>
           <w:ilvl w:val="0"/>
-          <w:numId w:val="1273"/>
+          <w:numId w:val="1282"/>
         </w:numPr>
       </w:pPr>
       <w:r>
@@ -11413,8 +11825,8 @@
         </w:pict>
       </w:r>
     </w:p>
-    <w:bookmarkEnd w:id="153"/>
-    <w:bookmarkStart w:id="154" w:name="us-ai-006-ai-outbreak-early-warning"/>
+    <w:bookmarkEnd w:id="156"/>
+    <w:bookmarkStart w:id="157" w:name="us-ai-006-ai-outbreak-early-warning"/>
     <w:p>
       <w:pPr>
         <w:pStyle w:val="Heading3"/>
@@ -11444,7 +11856,7 @@
         <w:pStyle w:val="Compact"/>
         <w:numPr>
           <w:ilvl w:val="0"/>
-          <w:numId w:val="1274"/>
+          <w:numId w:val="1283"/>
         </w:numPr>
       </w:pPr>
       <w:r>
@@ -11456,7 +11868,7 @@
         <w:pStyle w:val="Compact"/>
         <w:numPr>
           <w:ilvl w:val="0"/>
-          <w:numId w:val="1275"/>
+          <w:numId w:val="1284"/>
         </w:numPr>
       </w:pPr>
       <w:r>
@@ -11468,7 +11880,7 @@
         <w:pStyle w:val="Compact"/>
         <w:numPr>
           <w:ilvl w:val="0"/>
-          <w:numId w:val="1276"/>
+          <w:numId w:val="1285"/>
         </w:numPr>
       </w:pPr>
       <w:r>
@@ -11480,7 +11892,7 @@
         <w:pStyle w:val="Compact"/>
         <w:numPr>
           <w:ilvl w:val="0"/>
-          <w:numId w:val="1277"/>
+          <w:numId w:val="1286"/>
         </w:numPr>
       </w:pPr>
       <w:r>
@@ -11492,7 +11904,7 @@
         <w:pStyle w:val="Compact"/>
         <w:numPr>
           <w:ilvl w:val="0"/>
-          <w:numId w:val="1278"/>
+          <w:numId w:val="1287"/>
         </w:numPr>
       </w:pPr>
       <w:r>
@@ -11532,8 +11944,8 @@
         </w:pict>
       </w:r>
     </w:p>
-    <w:bookmarkEnd w:id="154"/>
-    <w:bookmarkStart w:id="155" w:name="us-ai-007-ai-provider-configuration"/>
+    <w:bookmarkEnd w:id="157"/>
+    <w:bookmarkStart w:id="158" w:name="us-ai-007-ai-provider-configuration"/>
     <w:p>
       <w:pPr>
         <w:pStyle w:val="Heading3"/>
@@ -11563,7 +11975,7 @@
         <w:pStyle w:val="Compact"/>
         <w:numPr>
           <w:ilvl w:val="0"/>
-          <w:numId w:val="1279"/>
+          <w:numId w:val="1288"/>
         </w:numPr>
       </w:pPr>
       <w:r>
@@ -11575,7 +11987,7 @@
         <w:pStyle w:val="Compact"/>
         <w:numPr>
           <w:ilvl w:val="0"/>
-          <w:numId w:val="1280"/>
+          <w:numId w:val="1289"/>
         </w:numPr>
       </w:pPr>
       <w:r>
@@ -11587,7 +11999,7 @@
         <w:pStyle w:val="Compact"/>
         <w:numPr>
           <w:ilvl w:val="0"/>
-          <w:numId w:val="1281"/>
+          <w:numId w:val="1290"/>
         </w:numPr>
       </w:pPr>
       <w:r>
@@ -11599,7 +12011,7 @@
         <w:pStyle w:val="Compact"/>
         <w:numPr>
           <w:ilvl w:val="0"/>
-          <w:numId w:val="1282"/>
+          <w:numId w:val="1291"/>
         </w:numPr>
       </w:pPr>
       <w:r>
@@ -11611,7 +12023,7 @@
         <w:pStyle w:val="Compact"/>
         <w:numPr>
           <w:ilvl w:val="0"/>
-          <w:numId w:val="1283"/>
+          <w:numId w:val="1292"/>
         </w:numPr>
       </w:pPr>
       <w:r>
@@ -11651,8 +12063,8 @@
         </w:pict>
       </w:r>
     </w:p>
-    <w:bookmarkEnd w:id="155"/>
-    <w:bookmarkStart w:id="156" w:name="us-ai-008-ai-token-usage-dashboard"/>
+    <w:bookmarkEnd w:id="158"/>
+    <w:bookmarkStart w:id="159" w:name="us-ai-008-ai-token-usage-dashboard"/>
     <w:p>
       <w:pPr>
         <w:pStyle w:val="Heading3"/>
@@ -11682,7 +12094,7 @@
         <w:pStyle w:val="Compact"/>
         <w:numPr>
           <w:ilvl w:val="0"/>
-          <w:numId w:val="1284"/>
+          <w:numId w:val="1293"/>
         </w:numPr>
       </w:pPr>
       <w:r>
@@ -11694,7 +12106,7 @@
         <w:pStyle w:val="Compact"/>
         <w:numPr>
           <w:ilvl w:val="0"/>
-          <w:numId w:val="1285"/>
+          <w:numId w:val="1294"/>
         </w:numPr>
       </w:pPr>
       <w:r>
@@ -11706,7 +12118,7 @@
         <w:pStyle w:val="Compact"/>
         <w:numPr>
           <w:ilvl w:val="0"/>
-          <w:numId w:val="1286"/>
+          <w:numId w:val="1295"/>
         </w:numPr>
       </w:pPr>
       <w:r>
@@ -11718,7 +12130,7 @@
         <w:pStyle w:val="Compact"/>
         <w:numPr>
           <w:ilvl w:val="0"/>
-          <w:numId w:val="1287"/>
+          <w:numId w:val="1296"/>
         </w:numPr>
       </w:pPr>
       <w:r>
@@ -11774,9 +12186,9 @@
         </w:pict>
       </w:r>
     </w:p>
-    <w:bookmarkEnd w:id="156"/>
-    <w:bookmarkEnd w:id="157"/>
-    <w:bookmarkStart w:id="160" w:name="epic-internationalisation-us-i18n"/>
+    <w:bookmarkEnd w:id="159"/>
+    <w:bookmarkEnd w:id="160"/>
+    <w:bookmarkStart w:id="163" w:name="epic-internationalisation-us-i18n"/>
     <w:p>
       <w:pPr>
         <w:pStyle w:val="Heading2"/>
@@ -11785,7 +12197,7 @@
         <w:t xml:space="preserve">Epic: Internationalisation (US-I18N)</w:t>
       </w:r>
     </w:p>
-    <w:bookmarkStart w:id="158" w:name="Xe110e82649ea98b26621e6c5cbec9335e5820e2"/>
+    <w:bookmarkStart w:id="161" w:name="Xe110e82649ea98b26621e6c5cbec9335e5820e2"/>
     <w:p>
       <w:pPr>
         <w:pStyle w:val="Heading3"/>
@@ -11815,7 +12227,7 @@
         <w:pStyle w:val="Compact"/>
         <w:numPr>
           <w:ilvl w:val="0"/>
-          <w:numId w:val="1288"/>
+          <w:numId w:val="1297"/>
         </w:numPr>
       </w:pPr>
       <w:r>
@@ -11827,7 +12239,7 @@
         <w:pStyle w:val="Compact"/>
         <w:numPr>
           <w:ilvl w:val="0"/>
-          <w:numId w:val="1289"/>
+          <w:numId w:val="1298"/>
         </w:numPr>
       </w:pPr>
       <w:r>
@@ -11839,7 +12251,7 @@
         <w:pStyle w:val="Compact"/>
         <w:numPr>
           <w:ilvl w:val="0"/>
-          <w:numId w:val="1290"/>
+          <w:numId w:val="1299"/>
         </w:numPr>
       </w:pPr>
       <w:r>
@@ -11851,7 +12263,7 @@
         <w:pStyle w:val="Compact"/>
         <w:numPr>
           <w:ilvl w:val="0"/>
-          <w:numId w:val="1291"/>
+          <w:numId w:val="1300"/>
         </w:numPr>
       </w:pPr>
       <w:r>
@@ -11875,7 +12287,7 @@
         <w:pStyle w:val="Compact"/>
         <w:numPr>
           <w:ilvl w:val="0"/>
-          <w:numId w:val="1292"/>
+          <w:numId w:val="1301"/>
         </w:numPr>
       </w:pPr>
       <w:r>
@@ -11915,8 +12327,8 @@
         </w:pict>
       </w:r>
     </w:p>
-    <w:bookmarkEnd w:id="158"/>
-    <w:bookmarkStart w:id="159" w:name="Xae8f7b199ec69a051fee1f9b06fa961efc54737"/>
+    <w:bookmarkEnd w:id="161"/>
+    <w:bookmarkStart w:id="162" w:name="Xae8f7b199ec69a051fee1f9b06fa961efc54737"/>
     <w:p>
       <w:pPr>
         <w:pStyle w:val="Heading3"/>
@@ -11946,7 +12358,7 @@
         <w:pStyle w:val="Compact"/>
         <w:numPr>
           <w:ilvl w:val="0"/>
-          <w:numId w:val="1293"/>
+          <w:numId w:val="1302"/>
         </w:numPr>
       </w:pPr>
       <w:r>
@@ -11985,7 +12397,7 @@
         <w:pStyle w:val="Compact"/>
         <w:numPr>
           <w:ilvl w:val="0"/>
-          <w:numId w:val="1294"/>
+          <w:numId w:val="1303"/>
         </w:numPr>
       </w:pPr>
       <w:r>
@@ -12012,7 +12424,7 @@
         <w:pStyle w:val="Compact"/>
         <w:numPr>
           <w:ilvl w:val="0"/>
-          <w:numId w:val="1295"/>
+          <w:numId w:val="1304"/>
         </w:numPr>
       </w:pPr>
       <w:r>
@@ -12036,7 +12448,7 @@
         <w:pStyle w:val="Compact"/>
         <w:numPr>
           <w:ilvl w:val="0"/>
-          <w:numId w:val="1296"/>
+          <w:numId w:val="1305"/>
         </w:numPr>
       </w:pPr>
       <w:r>
@@ -12088,9 +12500,9 @@
         </w:pict>
       </w:r>
     </w:p>
-    <w:bookmarkEnd w:id="159"/>
-    <w:bookmarkEnd w:id="160"/>
-    <w:bookmarkStart w:id="164" w:name="backlog-summary"/>
+    <w:bookmarkEnd w:id="162"/>
+    <w:bookmarkEnd w:id="163"/>
+    <w:bookmarkStart w:id="167" w:name="backlog-summary"/>
     <w:p>
       <w:pPr>
         <w:pStyle w:val="Heading2"/>
@@ -12099,7 +12511,7 @@
         <w:t xml:space="preserve">Backlog Summary</w:t>
       </w:r>
     </w:p>
-    <w:bookmarkStart w:id="161" w:name="story-counts-by-phase"/>
+    <w:bookmarkStart w:id="164" w:name="story-counts-by-phase"/>
     <w:p>
       <w:pPr>
         <w:pStyle w:val="Heading3"/>
@@ -12400,8 +12812,8 @@
         </w:tc>
       </w:tr>
     </w:tbl>
-    <w:bookmarkEnd w:id="161"/>
-    <w:bookmarkStart w:id="162" w:name="phase-1-breakdown-by-epic"/>
+    <w:bookmarkEnd w:id="164"/>
+    <w:bookmarkStart w:id="165" w:name="phase-1-breakdown-by-epic"/>
     <w:p>
       <w:pPr>
         <w:pStyle w:val="Heading3"/>
@@ -12775,8 +13187,8 @@
         </w:tc>
       </w:tr>
     </w:tbl>
-    <w:bookmarkEnd w:id="162"/>
-    <w:bookmarkStart w:id="163" w:name="sprint-recommendations-phase-1"/>
+    <w:bookmarkEnd w:id="165"/>
+    <w:bookmarkStart w:id="166" w:name="sprint-recommendations-phase-1"/>
     <w:p>
       <w:pPr>
         <w:pStyle w:val="Heading3"/>
@@ -12806,7 +13218,7 @@
         <w:pStyle w:val="Compact"/>
         <w:numPr>
           <w:ilvl w:val="0"/>
-          <w:numId w:val="1297"/>
+          <w:numId w:val="1306"/>
         </w:numPr>
       </w:pPr>
       <w:r>
@@ -12818,7 +13230,7 @@
         <w:pStyle w:val="Compact"/>
         <w:numPr>
           <w:ilvl w:val="0"/>
-          <w:numId w:val="1297"/>
+          <w:numId w:val="1306"/>
         </w:numPr>
       </w:pPr>
       <w:r>
@@ -12830,7 +13242,7 @@
         <w:pStyle w:val="Compact"/>
         <w:numPr>
           <w:ilvl w:val="0"/>
-          <w:numId w:val="1297"/>
+          <w:numId w:val="1306"/>
         </w:numPr>
       </w:pPr>
       <w:r>
@@ -12842,7 +13254,7 @@
         <w:pStyle w:val="Compact"/>
         <w:numPr>
           <w:ilvl w:val="0"/>
-          <w:numId w:val="1297"/>
+          <w:numId w:val="1306"/>
         </w:numPr>
       </w:pPr>
       <w:r>
@@ -12862,7 +13274,7 @@
         <w:pStyle w:val="Compact"/>
         <w:numPr>
           <w:ilvl w:val="0"/>
-          <w:numId w:val="1298"/>
+          <w:numId w:val="1307"/>
         </w:numPr>
       </w:pPr>
       <w:r>
@@ -12874,7 +13286,7 @@
         <w:pStyle w:val="Compact"/>
         <w:numPr>
           <w:ilvl w:val="0"/>
-          <w:numId w:val="1298"/>
+          <w:numId w:val="1307"/>
         </w:numPr>
       </w:pPr>
       <w:r>
@@ -12894,7 +13306,7 @@
         <w:pStyle w:val="Compact"/>
         <w:numPr>
           <w:ilvl w:val="0"/>
-          <w:numId w:val="1299"/>
+          <w:numId w:val="1308"/>
         </w:numPr>
       </w:pPr>
       <w:r>
@@ -12914,7 +13326,7 @@
         <w:pStyle w:val="Compact"/>
         <w:numPr>
           <w:ilvl w:val="0"/>
-          <w:numId w:val="1300"/>
+          <w:numId w:val="1309"/>
         </w:numPr>
       </w:pPr>
       <w:r>
@@ -12926,7 +13338,7 @@
         <w:pStyle w:val="Compact"/>
         <w:numPr>
           <w:ilvl w:val="0"/>
-          <w:numId w:val="1300"/>
+          <w:numId w:val="1309"/>
         </w:numPr>
       </w:pPr>
       <w:r>
@@ -12946,7 +13358,7 @@
         <w:pStyle w:val="Compact"/>
         <w:numPr>
           <w:ilvl w:val="0"/>
-          <w:numId w:val="1301"/>
+          <w:numId w:val="1310"/>
         </w:numPr>
       </w:pPr>
       <w:r>
@@ -12966,7 +13378,7 @@
         <w:pStyle w:val="Compact"/>
         <w:numPr>
           <w:ilvl w:val="0"/>
-          <w:numId w:val="1302"/>
+          <w:numId w:val="1311"/>
         </w:numPr>
       </w:pPr>
       <w:r>
@@ -12986,7 +13398,7 @@
         <w:pStyle w:val="Compact"/>
         <w:numPr>
           <w:ilvl w:val="0"/>
-          <w:numId w:val="1303"/>
+          <w:numId w:val="1312"/>
         </w:numPr>
       </w:pPr>
       <w:r>
@@ -13006,7 +13418,7 @@
         <w:pStyle w:val="Compact"/>
         <w:numPr>
           <w:ilvl w:val="0"/>
-          <w:numId w:val="1304"/>
+          <w:numId w:val="1313"/>
         </w:numPr>
       </w:pPr>
       <w:r>
@@ -13018,7 +13430,7 @@
         <w:pStyle w:val="Compact"/>
         <w:numPr>
           <w:ilvl w:val="0"/>
-          <w:numId w:val="1304"/>
+          <w:numId w:val="1313"/>
         </w:numPr>
       </w:pPr>
       <w:r>
@@ -13030,7 +13442,7 @@
         <w:pStyle w:val="Compact"/>
         <w:numPr>
           <w:ilvl w:val="0"/>
-          <w:numId w:val="1304"/>
+          <w:numId w:val="1313"/>
         </w:numPr>
       </w:pPr>
       <w:r>
@@ -13045,9 +13457,9 @@
         <w:t xml:space="preserve">Estimated Phase 1 Duration: 8 sprints (16 weeks / 4 months), consistent with the 6-month Phase 1 target with buffer for QA, UAT, and pilot deployment.</w:t>
       </w:r>
     </w:p>
-    <w:bookmarkEnd w:id="163"/>
-    <w:bookmarkEnd w:id="164"/>
-    <w:bookmarkEnd w:id="165"/>
+    <w:bookmarkEnd w:id="166"/>
+    <w:bookmarkEnd w:id="167"/>
+    <w:bookmarkEnd w:id="168"/>
     <w:sectPr>
       <w:footerReference r:id="rId9" w:type="default"/>
       <w:headerReference r:id="rId10" w:type="default"/>
@@ -14495,27 +14907,54 @@
     <w:abstractNumId w:val="992"/>
   </w:num>
   <w:num w:numId="1297">
+    <w:abstractNumId w:val="992"/>
+  </w:num>
+  <w:num w:numId="1298">
+    <w:abstractNumId w:val="992"/>
+  </w:num>
+  <w:num w:numId="1299">
+    <w:abstractNumId w:val="992"/>
+  </w:num>
+  <w:num w:numId="1300">
+    <w:abstractNumId w:val="992"/>
+  </w:num>
+  <w:num w:numId="1301">
+    <w:abstractNumId w:val="992"/>
+  </w:num>
+  <w:num w:numId="1302">
+    <w:abstractNumId w:val="992"/>
+  </w:num>
+  <w:num w:numId="1303">
+    <w:abstractNumId w:val="992"/>
+  </w:num>
+  <w:num w:numId="1304">
+    <w:abstractNumId w:val="992"/>
+  </w:num>
+  <w:num w:numId="1305">
+    <w:abstractNumId w:val="992"/>
+  </w:num>
+  <w:num w:numId="1306">
     <w:abstractNumId w:val="991"/>
   </w:num>
-  <w:num w:numId="1298">
+  <w:num w:numId="1307">
     <w:abstractNumId w:val="991"/>
   </w:num>
-  <w:num w:numId="1299">
+  <w:num w:numId="1308">
     <w:abstractNumId w:val="991"/>
   </w:num>
-  <w:num w:numId="1300">
+  <w:num w:numId="1309">
     <w:abstractNumId w:val="991"/>
   </w:num>
-  <w:num w:numId="1301">
+  <w:num w:numId="1310">
     <w:abstractNumId w:val="991"/>
   </w:num>
-  <w:num w:numId="1302">
+  <w:num w:numId="1311">
     <w:abstractNumId w:val="991"/>
   </w:num>
-  <w:num w:numId="1303">
+  <w:num w:numId="1312">
     <w:abstractNumId w:val="991"/>
   </w:num>
-  <w:num w:numId="1304">
+  <w:num w:numId="1313">
     <w:abstractNumId w:val="991"/>
   </w:num>
 </w:numbering>

</xml_diff>